<commit_message>
Added group by examples
</commit_message>
<xml_diff>
--- a/sql.docx
+++ b/sql.docx
@@ -4,8 +4,13 @@
   <w:body>
     <w:p>
       <w:r>
-        <w:t>create table employees(</w:t>
-      </w:r>
+        <w:t xml:space="preserve">create table </w:t>
+      </w:r>
+      <w:proofErr w:type="gramStart"/>
+      <w:r>
+        <w:t>employees(</w:t>
+      </w:r>
+      <w:proofErr w:type="gramEnd"/>
     </w:p>
     <w:p>
       <w:r>
@@ -14,12 +19,28 @@
     </w:p>
     <w:p>
       <w:r>
-        <w:t xml:space="preserve">  name varchar(50),</w:t>
-      </w:r>
-    </w:p>
-    <w:p>
-      <w:r>
-        <w:t xml:space="preserve">  department varchar(10),</w:t>
+        <w:t xml:space="preserve">  name </w:t>
+      </w:r>
+      <w:proofErr w:type="gramStart"/>
+      <w:r>
+        <w:t>varchar(</w:t>
+      </w:r>
+      <w:proofErr w:type="gramEnd"/>
+      <w:r>
+        <w:t>50),</w:t>
+      </w:r>
+    </w:p>
+    <w:p>
+      <w:r>
+        <w:t xml:space="preserve">  department </w:t>
+      </w:r>
+      <w:proofErr w:type="gramStart"/>
+      <w:r>
+        <w:t>varchar(</w:t>
+      </w:r>
+      <w:proofErr w:type="gramEnd"/>
+      <w:r>
+        <w:t>10),</w:t>
       </w:r>
     </w:p>
     <w:p>
@@ -33,12 +54,20 @@
     <w:p/>
     <w:p>
       <w:r>
-        <w:t>insert into employees values</w:t>
-      </w:r>
-    </w:p>
-    <w:p>
-      <w:r>
-        <w:t xml:space="preserve">  (1,"Rashmi","IT",500000),</w:t>
+        <w:t xml:space="preserve">insert into </w:t>
+      </w:r>
+      <w:proofErr w:type="gramStart"/>
+      <w:r>
+        <w:t>employees</w:t>
+      </w:r>
+      <w:proofErr w:type="gramEnd"/>
+      <w:r>
+        <w:t xml:space="preserve"> values</w:t>
+      </w:r>
+    </w:p>
+    <w:p>
+      <w:r>
+        <w:t xml:space="preserve">  (1,"Rashmi","IT",50000),</w:t>
       </w:r>
     </w:p>
     <w:p>
@@ -390,8 +419,13 @@
     </w:p>
     <w:p>
       <w:r>
-        <w:t>order by salary desc</w:t>
-      </w:r>
+        <w:t xml:space="preserve">order by salary </w:t>
+      </w:r>
+      <w:proofErr w:type="spellStart"/>
+      <w:r>
+        <w:t>desc</w:t>
+      </w:r>
+      <w:proofErr w:type="spellEnd"/>
     </w:p>
     <w:p>
       <w:r>
@@ -438,8 +472,13 @@
     </w:p>
     <w:p>
       <w:r>
-        <w:t>order by salary desc</w:t>
-      </w:r>
+        <w:t xml:space="preserve">order by salary </w:t>
+      </w:r>
+      <w:proofErr w:type="spellStart"/>
+      <w:r>
+        <w:t>desc</w:t>
+      </w:r>
+      <w:proofErr w:type="spellEnd"/>
     </w:p>
     <w:p>
       <w:r>
@@ -486,7 +525,15 @@
         <w:pStyle w:val="ListParagraph"/>
       </w:pPr>
       <w:r>
-        <w:t>select count(*) from employees</w:t>
+        <w:t xml:space="preserve">select </w:t>
+      </w:r>
+      <w:proofErr w:type="gramStart"/>
+      <w:r>
+        <w:t>count(</w:t>
+      </w:r>
+      <w:proofErr w:type="gramEnd"/>
+      <w:r>
+        <w:t>*) from employees</w:t>
       </w:r>
     </w:p>
     <w:p>
@@ -531,7 +578,15 @@
         <w:pStyle w:val="ListParagraph"/>
       </w:pPr>
       <w:r>
-        <w:t>select avg(salary) from employees</w:t>
+        <w:t xml:space="preserve">select </w:t>
+      </w:r>
+      <w:proofErr w:type="spellStart"/>
+      <w:r>
+        <w:t>avg</w:t>
+      </w:r>
+      <w:proofErr w:type="spellEnd"/>
+      <w:r>
+        <w:t>(salary) from employees</w:t>
       </w:r>
     </w:p>
     <w:p>
@@ -655,8 +710,836 @@
         <w:pStyle w:val="ListParagraph"/>
       </w:pPr>
       <w:r>
-        <w:t>select avg(salary) from employees where salary &gt; 40000</w:t>
-      </w:r>
+        <w:t xml:space="preserve">select </w:t>
+      </w:r>
+      <w:proofErr w:type="spellStart"/>
+      <w:r>
+        <w:t>avg</w:t>
+      </w:r>
+      <w:proofErr w:type="spellEnd"/>
+      <w:r>
+        <w:t>(salary) from employees where salary &gt; 40000</w:t>
+      </w:r>
+    </w:p>
+    <w:p>
+      <w:pPr>
+        <w:pStyle w:val="ListParagraph"/>
+      </w:pPr>
+    </w:p>
+    <w:p>
+      <w:pPr>
+        <w:pStyle w:val="ListParagraph"/>
+      </w:pPr>
+    </w:p>
+    <w:p>
+      <w:pPr>
+        <w:pStyle w:val="ListParagraph"/>
+      </w:pPr>
+      <w:r>
+        <w:t>GROUP BY</w:t>
+      </w:r>
+    </w:p>
+    <w:p>
+      <w:pPr>
+        <w:spacing w:before="100" w:beforeAutospacing="1" w:after="100" w:afterAutospacing="1" w:line="240" w:lineRule="auto"/>
+        <w:rPr>
+          <w:rFonts w:ascii="Times New Roman" w:eastAsia="Times New Roman" w:hAnsi="Times New Roman" w:cs="Times New Roman"/>
+          <w:sz w:val="24"/>
+          <w:szCs w:val="24"/>
+          <w:lang w:eastAsia="en-IN"/>
+        </w:rPr>
+      </w:pPr>
+      <w:r>
+        <w:rPr>
+          <w:rFonts w:ascii="Courier New" w:eastAsia="Times New Roman" w:hAnsi="Courier New" w:cs="Courier New"/>
+          <w:sz w:val="20"/>
+          <w:szCs w:val="20"/>
+          <w:lang w:eastAsia="en-IN"/>
+        </w:rPr>
+        <w:t>GROUP BY</w:t>
+      </w:r>
+      <w:r>
+        <w:rPr>
+          <w:rFonts w:ascii="Times New Roman" w:eastAsia="Times New Roman" w:hAnsi="Times New Roman" w:cs="Times New Roman"/>
+          <w:sz w:val="24"/>
+          <w:szCs w:val="24"/>
+          <w:lang w:eastAsia="en-IN"/>
+        </w:rPr>
+        <w:t xml:space="preserve"> is used to </w:t>
+      </w:r>
+      <w:r>
+        <w:rPr>
+          <w:rFonts w:ascii="Times New Roman" w:eastAsia="Times New Roman" w:hAnsi="Times New Roman" w:cs="Times New Roman"/>
+          <w:b/>
+          <w:bCs/>
+          <w:sz w:val="24"/>
+          <w:szCs w:val="24"/>
+          <w:lang w:eastAsia="en-IN"/>
+        </w:rPr>
+        <w:t>group rows that have the same value</w:t>
+      </w:r>
+      <w:r>
+        <w:rPr>
+          <w:rFonts w:ascii="Times New Roman" w:eastAsia="Times New Roman" w:hAnsi="Times New Roman" w:cs="Times New Roman"/>
+          <w:sz w:val="24"/>
+          <w:szCs w:val="24"/>
+          <w:lang w:eastAsia="en-IN"/>
+        </w:rPr>
+        <w:t xml:space="preserve"> in one or more columns.</w:t>
+      </w:r>
+    </w:p>
+    <w:p>
+      <w:pPr>
+        <w:spacing w:before="100" w:beforeAutospacing="1" w:after="100" w:afterAutospacing="1" w:line="240" w:lineRule="auto"/>
+        <w:rPr>
+          <w:rFonts w:ascii="Times New Roman" w:eastAsia="Times New Roman" w:hAnsi="Times New Roman" w:cs="Times New Roman"/>
+          <w:sz w:val="24"/>
+          <w:szCs w:val="24"/>
+          <w:lang w:eastAsia="en-IN"/>
+        </w:rPr>
+      </w:pPr>
+      <w:r>
+        <w:rPr>
+          <w:rFonts w:ascii="Times New Roman" w:eastAsia="Times New Roman" w:hAnsi="Times New Roman" w:cs="Times New Roman"/>
+          <w:sz w:val="24"/>
+          <w:szCs w:val="24"/>
+          <w:lang w:eastAsia="en-IN"/>
+        </w:rPr>
+        <w:t>It is usually used with aggregate functions like:</w:t>
+      </w:r>
+    </w:p>
+    <w:p>
+      <w:pPr>
+        <w:numPr>
+          <w:ilvl w:val="0"/>
+          <w:numId w:val="2"/>
+        </w:numPr>
+        <w:spacing w:before="100" w:beforeAutospacing="1" w:after="100" w:afterAutospacing="1" w:line="240" w:lineRule="auto"/>
+        <w:rPr>
+          <w:rFonts w:ascii="Times New Roman" w:eastAsia="Times New Roman" w:hAnsi="Times New Roman" w:cs="Times New Roman"/>
+          <w:sz w:val="24"/>
+          <w:szCs w:val="24"/>
+          <w:lang w:eastAsia="en-IN"/>
+        </w:rPr>
+      </w:pPr>
+      <w:proofErr w:type="gramStart"/>
+      <w:r>
+        <w:rPr>
+          <w:rFonts w:ascii="Courier New" w:eastAsia="Times New Roman" w:hAnsi="Courier New" w:cs="Courier New"/>
+          <w:sz w:val="20"/>
+          <w:szCs w:val="20"/>
+          <w:lang w:eastAsia="en-IN"/>
+        </w:rPr>
+        <w:t>COUNT(</w:t>
+      </w:r>
+      <w:proofErr w:type="gramEnd"/>
+      <w:r>
+        <w:rPr>
+          <w:rFonts w:ascii="Courier New" w:eastAsia="Times New Roman" w:hAnsi="Courier New" w:cs="Courier New"/>
+          <w:sz w:val="20"/>
+          <w:szCs w:val="20"/>
+          <w:lang w:eastAsia="en-IN"/>
+        </w:rPr>
+        <w:t>)</w:t>
+      </w:r>
+      <w:r>
+        <w:rPr>
+          <w:rFonts w:ascii="Times New Roman" w:eastAsia="Times New Roman" w:hAnsi="Times New Roman" w:cs="Times New Roman"/>
+          <w:sz w:val="24"/>
+          <w:szCs w:val="24"/>
+          <w:lang w:eastAsia="en-IN"/>
+        </w:rPr>
+        <w:t xml:space="preserve"> </w:t>
+      </w:r>
+    </w:p>
+    <w:p>
+      <w:pPr>
+        <w:numPr>
+          <w:ilvl w:val="0"/>
+          <w:numId w:val="2"/>
+        </w:numPr>
+        <w:spacing w:before="100" w:beforeAutospacing="1" w:after="100" w:afterAutospacing="1" w:line="240" w:lineRule="auto"/>
+        <w:rPr>
+          <w:rFonts w:ascii="Times New Roman" w:eastAsia="Times New Roman" w:hAnsi="Times New Roman" w:cs="Times New Roman"/>
+          <w:sz w:val="24"/>
+          <w:szCs w:val="24"/>
+          <w:lang w:eastAsia="en-IN"/>
+        </w:rPr>
+      </w:pPr>
+      <w:proofErr w:type="gramStart"/>
+      <w:r>
+        <w:rPr>
+          <w:rFonts w:ascii="Courier New" w:eastAsia="Times New Roman" w:hAnsi="Courier New" w:cs="Courier New"/>
+          <w:sz w:val="20"/>
+          <w:szCs w:val="20"/>
+          <w:lang w:eastAsia="en-IN"/>
+        </w:rPr>
+        <w:t>SUM(</w:t>
+      </w:r>
+      <w:proofErr w:type="gramEnd"/>
+      <w:r>
+        <w:rPr>
+          <w:rFonts w:ascii="Courier New" w:eastAsia="Times New Roman" w:hAnsi="Courier New" w:cs="Courier New"/>
+          <w:sz w:val="20"/>
+          <w:szCs w:val="20"/>
+          <w:lang w:eastAsia="en-IN"/>
+        </w:rPr>
+        <w:t>)</w:t>
+      </w:r>
+      <w:r>
+        <w:rPr>
+          <w:rFonts w:ascii="Times New Roman" w:eastAsia="Times New Roman" w:hAnsi="Times New Roman" w:cs="Times New Roman"/>
+          <w:sz w:val="24"/>
+          <w:szCs w:val="24"/>
+          <w:lang w:eastAsia="en-IN"/>
+        </w:rPr>
+        <w:t xml:space="preserve"> </w:t>
+      </w:r>
+    </w:p>
+    <w:p>
+      <w:pPr>
+        <w:numPr>
+          <w:ilvl w:val="0"/>
+          <w:numId w:val="2"/>
+        </w:numPr>
+        <w:spacing w:before="100" w:beforeAutospacing="1" w:after="100" w:afterAutospacing="1" w:line="240" w:lineRule="auto"/>
+        <w:rPr>
+          <w:rFonts w:ascii="Times New Roman" w:eastAsia="Times New Roman" w:hAnsi="Times New Roman" w:cs="Times New Roman"/>
+          <w:sz w:val="24"/>
+          <w:szCs w:val="24"/>
+          <w:lang w:eastAsia="en-IN"/>
+        </w:rPr>
+      </w:pPr>
+      <w:proofErr w:type="gramStart"/>
+      <w:r>
+        <w:rPr>
+          <w:rFonts w:ascii="Courier New" w:eastAsia="Times New Roman" w:hAnsi="Courier New" w:cs="Courier New"/>
+          <w:sz w:val="20"/>
+          <w:szCs w:val="20"/>
+          <w:lang w:eastAsia="en-IN"/>
+        </w:rPr>
+        <w:t>AVG(</w:t>
+      </w:r>
+      <w:proofErr w:type="gramEnd"/>
+      <w:r>
+        <w:rPr>
+          <w:rFonts w:ascii="Courier New" w:eastAsia="Times New Roman" w:hAnsi="Courier New" w:cs="Courier New"/>
+          <w:sz w:val="20"/>
+          <w:szCs w:val="20"/>
+          <w:lang w:eastAsia="en-IN"/>
+        </w:rPr>
+        <w:t>)</w:t>
+      </w:r>
+      <w:r>
+        <w:rPr>
+          <w:rFonts w:ascii="Times New Roman" w:eastAsia="Times New Roman" w:hAnsi="Times New Roman" w:cs="Times New Roman"/>
+          <w:sz w:val="24"/>
+          <w:szCs w:val="24"/>
+          <w:lang w:eastAsia="en-IN"/>
+        </w:rPr>
+        <w:t xml:space="preserve"> </w:t>
+      </w:r>
+    </w:p>
+    <w:p>
+      <w:pPr>
+        <w:numPr>
+          <w:ilvl w:val="0"/>
+          <w:numId w:val="2"/>
+        </w:numPr>
+        <w:spacing w:before="100" w:beforeAutospacing="1" w:after="100" w:afterAutospacing="1" w:line="240" w:lineRule="auto"/>
+        <w:rPr>
+          <w:rFonts w:ascii="Times New Roman" w:eastAsia="Times New Roman" w:hAnsi="Times New Roman" w:cs="Times New Roman"/>
+          <w:sz w:val="24"/>
+          <w:szCs w:val="24"/>
+          <w:lang w:eastAsia="en-IN"/>
+        </w:rPr>
+      </w:pPr>
+      <w:proofErr w:type="gramStart"/>
+      <w:r>
+        <w:rPr>
+          <w:rFonts w:ascii="Courier New" w:eastAsia="Times New Roman" w:hAnsi="Courier New" w:cs="Courier New"/>
+          <w:sz w:val="20"/>
+          <w:szCs w:val="20"/>
+          <w:lang w:eastAsia="en-IN"/>
+        </w:rPr>
+        <w:t>MIN(</w:t>
+      </w:r>
+      <w:proofErr w:type="gramEnd"/>
+      <w:r>
+        <w:rPr>
+          <w:rFonts w:ascii="Courier New" w:eastAsia="Times New Roman" w:hAnsi="Courier New" w:cs="Courier New"/>
+          <w:sz w:val="20"/>
+          <w:szCs w:val="20"/>
+          <w:lang w:eastAsia="en-IN"/>
+        </w:rPr>
+        <w:t>)</w:t>
+      </w:r>
+      <w:r>
+        <w:rPr>
+          <w:rFonts w:ascii="Times New Roman" w:eastAsia="Times New Roman" w:hAnsi="Times New Roman" w:cs="Times New Roman"/>
+          <w:sz w:val="24"/>
+          <w:szCs w:val="24"/>
+          <w:lang w:eastAsia="en-IN"/>
+        </w:rPr>
+        <w:t xml:space="preserve"> </w:t>
+      </w:r>
+    </w:p>
+    <w:p>
+      <w:pPr>
+        <w:numPr>
+          <w:ilvl w:val="0"/>
+          <w:numId w:val="2"/>
+        </w:numPr>
+        <w:spacing w:before="100" w:beforeAutospacing="1" w:after="100" w:afterAutospacing="1" w:line="240" w:lineRule="auto"/>
+        <w:rPr>
+          <w:rFonts w:ascii="Times New Roman" w:eastAsia="Times New Roman" w:hAnsi="Times New Roman" w:cs="Times New Roman"/>
+          <w:sz w:val="24"/>
+          <w:szCs w:val="24"/>
+          <w:lang w:eastAsia="en-IN"/>
+        </w:rPr>
+      </w:pPr>
+      <w:proofErr w:type="gramStart"/>
+      <w:r>
+        <w:rPr>
+          <w:rFonts w:ascii="Courier New" w:eastAsia="Times New Roman" w:hAnsi="Courier New" w:cs="Courier New"/>
+          <w:sz w:val="20"/>
+          <w:szCs w:val="20"/>
+          <w:lang w:eastAsia="en-IN"/>
+        </w:rPr>
+        <w:t>MAX(</w:t>
+      </w:r>
+      <w:proofErr w:type="gramEnd"/>
+      <w:r>
+        <w:rPr>
+          <w:rFonts w:ascii="Courier New" w:eastAsia="Times New Roman" w:hAnsi="Courier New" w:cs="Courier New"/>
+          <w:sz w:val="20"/>
+          <w:szCs w:val="20"/>
+          <w:lang w:eastAsia="en-IN"/>
+        </w:rPr>
+        <w:t>)</w:t>
+      </w:r>
+    </w:p>
+    <w:p>
+      <w:pPr>
+        <w:spacing w:before="100" w:beforeAutospacing="1" w:after="100" w:afterAutospacing="1" w:line="240" w:lineRule="auto"/>
+      </w:pPr>
+      <w:r>
+        <w:t>Count employees in each department</w:t>
+      </w:r>
+    </w:p>
+    <w:p>
+      <w:pPr>
+        <w:spacing w:before="100" w:beforeAutospacing="1" w:after="100" w:afterAutospacing="1" w:line="240" w:lineRule="auto"/>
+        <w:rPr>
+          <w:rFonts w:ascii="Times New Roman" w:eastAsia="Times New Roman" w:hAnsi="Times New Roman" w:cs="Times New Roman"/>
+          <w:sz w:val="24"/>
+          <w:szCs w:val="24"/>
+          <w:lang w:eastAsia="en-IN"/>
+        </w:rPr>
+      </w:pPr>
+      <w:r>
+        <w:rPr>
+          <w:rFonts w:ascii="Times New Roman" w:eastAsia="Times New Roman" w:hAnsi="Times New Roman" w:cs="Times New Roman"/>
+          <w:sz w:val="24"/>
+          <w:szCs w:val="24"/>
+          <w:lang w:eastAsia="en-IN"/>
+        </w:rPr>
+        <w:t xml:space="preserve">select department, </w:t>
+      </w:r>
+      <w:proofErr w:type="gramStart"/>
+      <w:r>
+        <w:rPr>
+          <w:rFonts w:ascii="Times New Roman" w:eastAsia="Times New Roman" w:hAnsi="Times New Roman" w:cs="Times New Roman"/>
+          <w:sz w:val="24"/>
+          <w:szCs w:val="24"/>
+          <w:lang w:eastAsia="en-IN"/>
+        </w:rPr>
+        <w:t>count(</w:t>
+      </w:r>
+      <w:proofErr w:type="gramEnd"/>
+      <w:r>
+        <w:rPr>
+          <w:rFonts w:ascii="Times New Roman" w:eastAsia="Times New Roman" w:hAnsi="Times New Roman" w:cs="Times New Roman"/>
+          <w:sz w:val="24"/>
+          <w:szCs w:val="24"/>
+          <w:lang w:eastAsia="en-IN"/>
+        </w:rPr>
+        <w:t xml:space="preserve">*) </w:t>
+      </w:r>
+    </w:p>
+    <w:p>
+      <w:pPr>
+        <w:spacing w:before="100" w:beforeAutospacing="1" w:after="100" w:afterAutospacing="1" w:line="240" w:lineRule="auto"/>
+        <w:rPr>
+          <w:rFonts w:ascii="Times New Roman" w:eastAsia="Times New Roman" w:hAnsi="Times New Roman" w:cs="Times New Roman"/>
+          <w:sz w:val="24"/>
+          <w:szCs w:val="24"/>
+          <w:lang w:eastAsia="en-IN"/>
+        </w:rPr>
+      </w:pPr>
+      <w:r>
+        <w:rPr>
+          <w:rFonts w:ascii="Times New Roman" w:eastAsia="Times New Roman" w:hAnsi="Times New Roman" w:cs="Times New Roman"/>
+          <w:sz w:val="24"/>
+          <w:szCs w:val="24"/>
+          <w:lang w:eastAsia="en-IN"/>
+        </w:rPr>
+        <w:t xml:space="preserve">from employees </w:t>
+      </w:r>
+    </w:p>
+    <w:p>
+      <w:pPr>
+        <w:spacing w:before="100" w:beforeAutospacing="1" w:after="100" w:afterAutospacing="1" w:line="240" w:lineRule="auto"/>
+        <w:rPr>
+          <w:rFonts w:ascii="Times New Roman" w:eastAsia="Times New Roman" w:hAnsi="Times New Roman" w:cs="Times New Roman"/>
+          <w:sz w:val="24"/>
+          <w:szCs w:val="24"/>
+          <w:lang w:eastAsia="en-IN"/>
+        </w:rPr>
+      </w:pPr>
+      <w:r>
+        <w:rPr>
+          <w:rFonts w:ascii="Times New Roman" w:eastAsia="Times New Roman" w:hAnsi="Times New Roman" w:cs="Times New Roman"/>
+          <w:sz w:val="24"/>
+          <w:szCs w:val="24"/>
+          <w:lang w:eastAsia="en-IN"/>
+        </w:rPr>
+        <w:t>group by department</w:t>
+      </w:r>
+    </w:p>
+    <w:p>
+      <w:pPr>
+        <w:spacing w:before="100" w:beforeAutospacing="1" w:after="100" w:afterAutospacing="1" w:line="240" w:lineRule="auto"/>
+        <w:rPr>
+          <w:rFonts w:ascii="Times New Roman" w:eastAsia="Times New Roman" w:hAnsi="Times New Roman" w:cs="Times New Roman"/>
+          <w:sz w:val="24"/>
+          <w:szCs w:val="24"/>
+          <w:lang w:eastAsia="en-IN"/>
+        </w:rPr>
+      </w:pPr>
+    </w:p>
+    <w:p>
+      <w:pPr>
+        <w:spacing w:before="100" w:beforeAutospacing="1" w:after="100" w:afterAutospacing="1" w:line="240" w:lineRule="auto"/>
+      </w:pPr>
+      <w:r>
+        <w:t>Total salary by department</w:t>
+      </w:r>
+    </w:p>
+    <w:p>
+      <w:pPr>
+        <w:spacing w:before="100" w:beforeAutospacing="1" w:after="100" w:afterAutospacing="1" w:line="240" w:lineRule="auto"/>
+        <w:rPr>
+          <w:rFonts w:ascii="Times New Roman" w:eastAsia="Times New Roman" w:hAnsi="Times New Roman" w:cs="Times New Roman"/>
+          <w:sz w:val="24"/>
+          <w:szCs w:val="24"/>
+          <w:lang w:eastAsia="en-IN"/>
+        </w:rPr>
+      </w:pPr>
+      <w:r>
+        <w:rPr>
+          <w:rFonts w:ascii="Times New Roman" w:eastAsia="Times New Roman" w:hAnsi="Times New Roman" w:cs="Times New Roman"/>
+          <w:sz w:val="24"/>
+          <w:szCs w:val="24"/>
+          <w:lang w:eastAsia="en-IN"/>
+        </w:rPr>
+        <w:t xml:space="preserve">select department, sum(salary) as </w:t>
+      </w:r>
+      <w:proofErr w:type="spellStart"/>
+      <w:r>
+        <w:rPr>
+          <w:rFonts w:ascii="Times New Roman" w:eastAsia="Times New Roman" w:hAnsi="Times New Roman" w:cs="Times New Roman"/>
+          <w:sz w:val="24"/>
+          <w:szCs w:val="24"/>
+          <w:lang w:eastAsia="en-IN"/>
+        </w:rPr>
+        <w:t>total_salary</w:t>
+      </w:r>
+      <w:proofErr w:type="spellEnd"/>
+    </w:p>
+    <w:p>
+      <w:pPr>
+        <w:spacing w:before="100" w:beforeAutospacing="1" w:after="100" w:afterAutospacing="1" w:line="240" w:lineRule="auto"/>
+        <w:rPr>
+          <w:rFonts w:ascii="Times New Roman" w:eastAsia="Times New Roman" w:hAnsi="Times New Roman" w:cs="Times New Roman"/>
+          <w:sz w:val="24"/>
+          <w:szCs w:val="24"/>
+          <w:lang w:eastAsia="en-IN"/>
+        </w:rPr>
+      </w:pPr>
+      <w:r>
+        <w:rPr>
+          <w:rFonts w:ascii="Times New Roman" w:eastAsia="Times New Roman" w:hAnsi="Times New Roman" w:cs="Times New Roman"/>
+          <w:sz w:val="24"/>
+          <w:szCs w:val="24"/>
+          <w:lang w:eastAsia="en-IN"/>
+        </w:rPr>
+        <w:t xml:space="preserve">from employees </w:t>
+      </w:r>
+    </w:p>
+    <w:p>
+      <w:pPr>
+        <w:spacing w:before="100" w:beforeAutospacing="1" w:after="100" w:afterAutospacing="1" w:line="240" w:lineRule="auto"/>
+        <w:rPr>
+          <w:rFonts w:ascii="Times New Roman" w:eastAsia="Times New Roman" w:hAnsi="Times New Roman" w:cs="Times New Roman"/>
+          <w:sz w:val="24"/>
+          <w:szCs w:val="24"/>
+          <w:lang w:eastAsia="en-IN"/>
+        </w:rPr>
+      </w:pPr>
+      <w:r>
+        <w:rPr>
+          <w:rFonts w:ascii="Times New Roman" w:eastAsia="Times New Roman" w:hAnsi="Times New Roman" w:cs="Times New Roman"/>
+          <w:sz w:val="24"/>
+          <w:szCs w:val="24"/>
+          <w:lang w:eastAsia="en-IN"/>
+        </w:rPr>
+        <w:t>group by department</w:t>
+      </w:r>
+    </w:p>
+    <w:p>
+      <w:pPr>
+        <w:spacing w:before="100" w:beforeAutospacing="1" w:after="100" w:afterAutospacing="1" w:line="240" w:lineRule="auto"/>
+        <w:rPr>
+          <w:rFonts w:ascii="Times New Roman" w:eastAsia="Times New Roman" w:hAnsi="Times New Roman" w:cs="Times New Roman"/>
+          <w:sz w:val="24"/>
+          <w:szCs w:val="24"/>
+          <w:lang w:eastAsia="en-IN"/>
+        </w:rPr>
+      </w:pPr>
+    </w:p>
+    <w:p>
+      <w:pPr>
+        <w:spacing w:before="100" w:beforeAutospacing="1" w:after="100" w:afterAutospacing="1" w:line="240" w:lineRule="auto"/>
+      </w:pPr>
+      <w:r>
+        <w:t>Average salary</w:t>
+      </w:r>
+    </w:p>
+    <w:p>
+      <w:pPr>
+        <w:spacing w:before="100" w:beforeAutospacing="1" w:after="100" w:afterAutospacing="1" w:line="240" w:lineRule="auto"/>
+        <w:rPr>
+          <w:rFonts w:ascii="Times New Roman" w:eastAsia="Times New Roman" w:hAnsi="Times New Roman" w:cs="Times New Roman"/>
+          <w:sz w:val="24"/>
+          <w:szCs w:val="24"/>
+          <w:lang w:eastAsia="en-IN"/>
+        </w:rPr>
+      </w:pPr>
+      <w:r>
+        <w:rPr>
+          <w:rFonts w:ascii="Times New Roman" w:eastAsia="Times New Roman" w:hAnsi="Times New Roman" w:cs="Times New Roman"/>
+          <w:sz w:val="24"/>
+          <w:szCs w:val="24"/>
+          <w:lang w:eastAsia="en-IN"/>
+        </w:rPr>
+        <w:t xml:space="preserve">select department, </w:t>
+      </w:r>
+      <w:proofErr w:type="spellStart"/>
+      <w:r>
+        <w:rPr>
+          <w:rFonts w:ascii="Times New Roman" w:eastAsia="Times New Roman" w:hAnsi="Times New Roman" w:cs="Times New Roman"/>
+          <w:sz w:val="24"/>
+          <w:szCs w:val="24"/>
+          <w:lang w:eastAsia="en-IN"/>
+        </w:rPr>
+        <w:t>avg</w:t>
+      </w:r>
+      <w:proofErr w:type="spellEnd"/>
+      <w:r>
+        <w:rPr>
+          <w:rFonts w:ascii="Times New Roman" w:eastAsia="Times New Roman" w:hAnsi="Times New Roman" w:cs="Times New Roman"/>
+          <w:sz w:val="24"/>
+          <w:szCs w:val="24"/>
+          <w:lang w:eastAsia="en-IN"/>
+        </w:rPr>
+        <w:t xml:space="preserve">(salary) as </w:t>
+      </w:r>
+      <w:proofErr w:type="spellStart"/>
+      <w:r>
+        <w:rPr>
+          <w:rFonts w:ascii="Times New Roman" w:eastAsia="Times New Roman" w:hAnsi="Times New Roman" w:cs="Times New Roman"/>
+          <w:sz w:val="24"/>
+          <w:szCs w:val="24"/>
+          <w:lang w:eastAsia="en-IN"/>
+        </w:rPr>
+        <w:t>avg_salary</w:t>
+      </w:r>
+      <w:proofErr w:type="spellEnd"/>
+    </w:p>
+    <w:p>
+      <w:pPr>
+        <w:spacing w:before="100" w:beforeAutospacing="1" w:after="100" w:afterAutospacing="1" w:line="240" w:lineRule="auto"/>
+        <w:rPr>
+          <w:rFonts w:ascii="Times New Roman" w:eastAsia="Times New Roman" w:hAnsi="Times New Roman" w:cs="Times New Roman"/>
+          <w:sz w:val="24"/>
+          <w:szCs w:val="24"/>
+          <w:lang w:eastAsia="en-IN"/>
+        </w:rPr>
+      </w:pPr>
+      <w:r>
+        <w:rPr>
+          <w:rFonts w:ascii="Times New Roman" w:eastAsia="Times New Roman" w:hAnsi="Times New Roman" w:cs="Times New Roman"/>
+          <w:sz w:val="24"/>
+          <w:szCs w:val="24"/>
+          <w:lang w:eastAsia="en-IN"/>
+        </w:rPr>
+        <w:t xml:space="preserve">from employees </w:t>
+      </w:r>
+    </w:p>
+    <w:p>
+      <w:pPr>
+        <w:spacing w:before="100" w:beforeAutospacing="1" w:after="100" w:afterAutospacing="1" w:line="240" w:lineRule="auto"/>
+        <w:rPr>
+          <w:rFonts w:ascii="Times New Roman" w:eastAsia="Times New Roman" w:hAnsi="Times New Roman" w:cs="Times New Roman"/>
+          <w:sz w:val="24"/>
+          <w:szCs w:val="24"/>
+          <w:lang w:eastAsia="en-IN"/>
+        </w:rPr>
+      </w:pPr>
+      <w:r>
+        <w:rPr>
+          <w:rFonts w:ascii="Times New Roman" w:eastAsia="Times New Roman" w:hAnsi="Times New Roman" w:cs="Times New Roman"/>
+          <w:sz w:val="24"/>
+          <w:szCs w:val="24"/>
+          <w:lang w:eastAsia="en-IN"/>
+        </w:rPr>
+        <w:t>group by department</w:t>
+      </w:r>
+    </w:p>
+    <w:p>
+      <w:pPr>
+        <w:spacing w:before="100" w:beforeAutospacing="1" w:after="100" w:afterAutospacing="1" w:line="240" w:lineRule="auto"/>
+        <w:rPr>
+          <w:rFonts w:ascii="Times New Roman" w:eastAsia="Times New Roman" w:hAnsi="Times New Roman" w:cs="Times New Roman"/>
+          <w:sz w:val="24"/>
+          <w:szCs w:val="24"/>
+          <w:lang w:eastAsia="en-IN"/>
+        </w:rPr>
+      </w:pPr>
+    </w:p>
+    <w:p>
+      <w:pPr>
+        <w:spacing w:before="100" w:beforeAutospacing="1" w:after="100" w:afterAutospacing="1" w:line="240" w:lineRule="auto"/>
+      </w:pPr>
+      <w:r>
+        <w:t>Find the highest salary in each department.</w:t>
+      </w:r>
+    </w:p>
+    <w:p>
+      <w:pPr>
+        <w:spacing w:before="100" w:beforeAutospacing="1" w:after="100" w:afterAutospacing="1" w:line="240" w:lineRule="auto"/>
+        <w:rPr>
+          <w:rFonts w:ascii="Times New Roman" w:eastAsia="Times New Roman" w:hAnsi="Times New Roman" w:cs="Times New Roman"/>
+          <w:sz w:val="24"/>
+          <w:szCs w:val="24"/>
+          <w:lang w:eastAsia="en-IN"/>
+        </w:rPr>
+      </w:pPr>
+    </w:p>
+    <w:p>
+      <w:pPr>
+        <w:spacing w:before="100" w:beforeAutospacing="1" w:after="100" w:afterAutospacing="1" w:line="240" w:lineRule="auto"/>
+        <w:rPr>
+          <w:rFonts w:ascii="Times New Roman" w:eastAsia="Times New Roman" w:hAnsi="Times New Roman" w:cs="Times New Roman"/>
+          <w:sz w:val="24"/>
+          <w:szCs w:val="24"/>
+          <w:lang w:eastAsia="en-IN"/>
+        </w:rPr>
+      </w:pPr>
+      <w:r>
+        <w:rPr>
+          <w:rFonts w:ascii="Times New Roman" w:eastAsia="Times New Roman" w:hAnsi="Times New Roman" w:cs="Times New Roman"/>
+          <w:sz w:val="24"/>
+          <w:szCs w:val="24"/>
+          <w:lang w:eastAsia="en-IN"/>
+        </w:rPr>
+        <w:t xml:space="preserve">select department, max(salary) as </w:t>
+      </w:r>
+      <w:proofErr w:type="spellStart"/>
+      <w:r>
+        <w:rPr>
+          <w:rFonts w:ascii="Times New Roman" w:eastAsia="Times New Roman" w:hAnsi="Times New Roman" w:cs="Times New Roman"/>
+          <w:sz w:val="24"/>
+          <w:szCs w:val="24"/>
+          <w:lang w:eastAsia="en-IN"/>
+        </w:rPr>
+        <w:t>max_salary</w:t>
+      </w:r>
+      <w:proofErr w:type="spellEnd"/>
+    </w:p>
+    <w:p>
+      <w:pPr>
+        <w:spacing w:before="100" w:beforeAutospacing="1" w:after="100" w:afterAutospacing="1" w:line="240" w:lineRule="auto"/>
+        <w:rPr>
+          <w:rFonts w:ascii="Times New Roman" w:eastAsia="Times New Roman" w:hAnsi="Times New Roman" w:cs="Times New Roman"/>
+          <w:sz w:val="24"/>
+          <w:szCs w:val="24"/>
+          <w:lang w:eastAsia="en-IN"/>
+        </w:rPr>
+      </w:pPr>
+      <w:r>
+        <w:rPr>
+          <w:rFonts w:ascii="Times New Roman" w:eastAsia="Times New Roman" w:hAnsi="Times New Roman" w:cs="Times New Roman"/>
+          <w:sz w:val="24"/>
+          <w:szCs w:val="24"/>
+          <w:lang w:eastAsia="en-IN"/>
+        </w:rPr>
+        <w:t>from employees</w:t>
+      </w:r>
+    </w:p>
+    <w:p>
+      <w:pPr>
+        <w:spacing w:before="100" w:beforeAutospacing="1" w:after="100" w:afterAutospacing="1" w:line="240" w:lineRule="auto"/>
+        <w:rPr>
+          <w:rFonts w:ascii="Times New Roman" w:eastAsia="Times New Roman" w:hAnsi="Times New Roman" w:cs="Times New Roman"/>
+          <w:sz w:val="24"/>
+          <w:szCs w:val="24"/>
+          <w:lang w:eastAsia="en-IN"/>
+        </w:rPr>
+      </w:pPr>
+      <w:r>
+        <w:rPr>
+          <w:rFonts w:ascii="Times New Roman" w:eastAsia="Times New Roman" w:hAnsi="Times New Roman" w:cs="Times New Roman"/>
+          <w:sz w:val="24"/>
+          <w:szCs w:val="24"/>
+          <w:lang w:eastAsia="en-IN"/>
+        </w:rPr>
+        <w:t>group by department</w:t>
+      </w:r>
+    </w:p>
+    <w:p>
+      <w:pPr>
+        <w:spacing w:before="100" w:beforeAutospacing="1" w:after="100" w:afterAutospacing="1" w:line="240" w:lineRule="auto"/>
+        <w:rPr>
+          <w:rFonts w:ascii="Times New Roman" w:eastAsia="Times New Roman" w:hAnsi="Times New Roman" w:cs="Times New Roman"/>
+          <w:sz w:val="24"/>
+          <w:szCs w:val="24"/>
+          <w:lang w:eastAsia="en-IN"/>
+        </w:rPr>
+      </w:pPr>
+    </w:p>
+    <w:p>
+      <w:pPr>
+        <w:spacing w:before="100" w:beforeAutospacing="1" w:after="100" w:afterAutospacing="1" w:line="240" w:lineRule="auto"/>
+      </w:pPr>
+      <w:r>
+        <w:t>Find the lowest salary in each department.</w:t>
+      </w:r>
+    </w:p>
+    <w:p>
+      <w:pPr>
+        <w:spacing w:before="100" w:beforeAutospacing="1" w:after="100" w:afterAutospacing="1" w:line="240" w:lineRule="auto"/>
+        <w:rPr>
+          <w:rFonts w:ascii="Times New Roman" w:eastAsia="Times New Roman" w:hAnsi="Times New Roman" w:cs="Times New Roman"/>
+          <w:sz w:val="24"/>
+          <w:szCs w:val="24"/>
+          <w:lang w:eastAsia="en-IN"/>
+        </w:rPr>
+      </w:pPr>
+    </w:p>
+    <w:p>
+      <w:pPr>
+        <w:spacing w:before="100" w:beforeAutospacing="1" w:after="100" w:afterAutospacing="1" w:line="240" w:lineRule="auto"/>
+        <w:rPr>
+          <w:rFonts w:ascii="Times New Roman" w:eastAsia="Times New Roman" w:hAnsi="Times New Roman" w:cs="Times New Roman"/>
+          <w:sz w:val="24"/>
+          <w:szCs w:val="24"/>
+          <w:lang w:eastAsia="en-IN"/>
+        </w:rPr>
+      </w:pPr>
+      <w:r>
+        <w:rPr>
+          <w:rFonts w:ascii="Times New Roman" w:eastAsia="Times New Roman" w:hAnsi="Times New Roman" w:cs="Times New Roman"/>
+          <w:sz w:val="24"/>
+          <w:szCs w:val="24"/>
+          <w:lang w:eastAsia="en-IN"/>
+        </w:rPr>
+        <w:t xml:space="preserve">select department, min(salary) as </w:t>
+      </w:r>
+      <w:proofErr w:type="spellStart"/>
+      <w:r>
+        <w:rPr>
+          <w:rFonts w:ascii="Times New Roman" w:eastAsia="Times New Roman" w:hAnsi="Times New Roman" w:cs="Times New Roman"/>
+          <w:sz w:val="24"/>
+          <w:szCs w:val="24"/>
+          <w:lang w:eastAsia="en-IN"/>
+        </w:rPr>
+        <w:t>min_salary</w:t>
+      </w:r>
+      <w:proofErr w:type="spellEnd"/>
+    </w:p>
+    <w:p>
+      <w:pPr>
+        <w:spacing w:before="100" w:beforeAutospacing="1" w:after="100" w:afterAutospacing="1" w:line="240" w:lineRule="auto"/>
+        <w:rPr>
+          <w:rFonts w:ascii="Times New Roman" w:eastAsia="Times New Roman" w:hAnsi="Times New Roman" w:cs="Times New Roman"/>
+          <w:sz w:val="24"/>
+          <w:szCs w:val="24"/>
+          <w:lang w:eastAsia="en-IN"/>
+        </w:rPr>
+      </w:pPr>
+      <w:r>
+        <w:rPr>
+          <w:rFonts w:ascii="Times New Roman" w:eastAsia="Times New Roman" w:hAnsi="Times New Roman" w:cs="Times New Roman"/>
+          <w:sz w:val="24"/>
+          <w:szCs w:val="24"/>
+          <w:lang w:eastAsia="en-IN"/>
+        </w:rPr>
+        <w:t>from employees</w:t>
+      </w:r>
+    </w:p>
+    <w:p>
+      <w:pPr>
+        <w:spacing w:before="100" w:beforeAutospacing="1" w:after="100" w:afterAutospacing="1" w:line="240" w:lineRule="auto"/>
+        <w:rPr>
+          <w:rFonts w:ascii="Times New Roman" w:eastAsia="Times New Roman" w:hAnsi="Times New Roman" w:cs="Times New Roman"/>
+          <w:sz w:val="24"/>
+          <w:szCs w:val="24"/>
+          <w:lang w:eastAsia="en-IN"/>
+        </w:rPr>
+      </w:pPr>
+      <w:r>
+        <w:rPr>
+          <w:rFonts w:ascii="Times New Roman" w:eastAsia="Times New Roman" w:hAnsi="Times New Roman" w:cs="Times New Roman"/>
+          <w:sz w:val="24"/>
+          <w:szCs w:val="24"/>
+          <w:lang w:eastAsia="en-IN"/>
+        </w:rPr>
+        <w:t>group by department</w:t>
+      </w:r>
+    </w:p>
+    <w:p>
+      <w:pPr>
+        <w:spacing w:before="100" w:beforeAutospacing="1" w:after="100" w:afterAutospacing="1" w:line="240" w:lineRule="auto"/>
+        <w:rPr>
+          <w:rFonts w:ascii="Times New Roman" w:eastAsia="Times New Roman" w:hAnsi="Times New Roman" w:cs="Times New Roman"/>
+          <w:sz w:val="24"/>
+          <w:szCs w:val="24"/>
+          <w:lang w:eastAsia="en-IN"/>
+        </w:rPr>
+      </w:pPr>
+    </w:p>
+    <w:p>
+      <w:pPr>
+        <w:spacing w:before="100" w:beforeAutospacing="1" w:after="100" w:afterAutospacing="1" w:line="240" w:lineRule="auto"/>
+        <w:rPr>
+          <w:rFonts w:ascii="Times New Roman" w:eastAsia="Times New Roman" w:hAnsi="Times New Roman" w:cs="Times New Roman"/>
+          <w:sz w:val="24"/>
+          <w:szCs w:val="24"/>
+          <w:lang w:eastAsia="en-IN"/>
+        </w:rPr>
+      </w:pPr>
+    </w:p>
+    <w:p>
+      <w:pPr>
+        <w:pStyle w:val="ListParagraph"/>
+      </w:pPr>
+    </w:p>
+    <w:p>
+      <w:pPr>
+        <w:pStyle w:val="ListParagraph"/>
+      </w:pPr>
     </w:p>
     <w:p/>
     <w:p/>
@@ -767,8 +1650,160 @@
       </w:pPr>
     </w:lvl>
   </w:abstractNum>
+  <w:abstractNum w:abstractNumId="1" w15:restartNumberingAfterBreak="0">
+    <w:nsid w:val="590E285F"/>
+    <w:multiLevelType w:val="multilevel"/>
+    <w:tmpl w:val="E192364A"/>
+    <w:lvl w:ilvl="0">
+      <w:start w:val="1"/>
+      <w:numFmt w:val="bullet"/>
+      <w:lvlText w:val=""/>
+      <w:lvlJc w:val="left"/>
+      <w:pPr>
+        <w:tabs>
+          <w:tab w:val="num" w:pos="720"/>
+        </w:tabs>
+        <w:ind w:left="720" w:hanging="360"/>
+      </w:pPr>
+      <w:rPr>
+        <w:rFonts w:ascii="Symbol" w:hAnsi="Symbol" w:hint="default"/>
+        <w:sz w:val="20"/>
+      </w:rPr>
+    </w:lvl>
+    <w:lvl w:ilvl="1" w:tentative="1">
+      <w:start w:val="1"/>
+      <w:numFmt w:val="bullet"/>
+      <w:lvlText w:val="o"/>
+      <w:lvlJc w:val="left"/>
+      <w:pPr>
+        <w:tabs>
+          <w:tab w:val="num" w:pos="1440"/>
+        </w:tabs>
+        <w:ind w:left="1440" w:hanging="360"/>
+      </w:pPr>
+      <w:rPr>
+        <w:rFonts w:ascii="Courier New" w:hAnsi="Courier New" w:hint="default"/>
+        <w:sz w:val="20"/>
+      </w:rPr>
+    </w:lvl>
+    <w:lvl w:ilvl="2" w:tentative="1">
+      <w:start w:val="1"/>
+      <w:numFmt w:val="bullet"/>
+      <w:lvlText w:val=""/>
+      <w:lvlJc w:val="left"/>
+      <w:pPr>
+        <w:tabs>
+          <w:tab w:val="num" w:pos="2160"/>
+        </w:tabs>
+        <w:ind w:left="2160" w:hanging="360"/>
+      </w:pPr>
+      <w:rPr>
+        <w:rFonts w:ascii="Wingdings" w:hAnsi="Wingdings" w:hint="default"/>
+        <w:sz w:val="20"/>
+      </w:rPr>
+    </w:lvl>
+    <w:lvl w:ilvl="3" w:tentative="1">
+      <w:start w:val="1"/>
+      <w:numFmt w:val="bullet"/>
+      <w:lvlText w:val=""/>
+      <w:lvlJc w:val="left"/>
+      <w:pPr>
+        <w:tabs>
+          <w:tab w:val="num" w:pos="2880"/>
+        </w:tabs>
+        <w:ind w:left="2880" w:hanging="360"/>
+      </w:pPr>
+      <w:rPr>
+        <w:rFonts w:ascii="Wingdings" w:hAnsi="Wingdings" w:hint="default"/>
+        <w:sz w:val="20"/>
+      </w:rPr>
+    </w:lvl>
+    <w:lvl w:ilvl="4" w:tentative="1">
+      <w:start w:val="1"/>
+      <w:numFmt w:val="bullet"/>
+      <w:lvlText w:val=""/>
+      <w:lvlJc w:val="left"/>
+      <w:pPr>
+        <w:tabs>
+          <w:tab w:val="num" w:pos="3600"/>
+        </w:tabs>
+        <w:ind w:left="3600" w:hanging="360"/>
+      </w:pPr>
+      <w:rPr>
+        <w:rFonts w:ascii="Wingdings" w:hAnsi="Wingdings" w:hint="default"/>
+        <w:sz w:val="20"/>
+      </w:rPr>
+    </w:lvl>
+    <w:lvl w:ilvl="5" w:tentative="1">
+      <w:start w:val="1"/>
+      <w:numFmt w:val="bullet"/>
+      <w:lvlText w:val=""/>
+      <w:lvlJc w:val="left"/>
+      <w:pPr>
+        <w:tabs>
+          <w:tab w:val="num" w:pos="4320"/>
+        </w:tabs>
+        <w:ind w:left="4320" w:hanging="360"/>
+      </w:pPr>
+      <w:rPr>
+        <w:rFonts w:ascii="Wingdings" w:hAnsi="Wingdings" w:hint="default"/>
+        <w:sz w:val="20"/>
+      </w:rPr>
+    </w:lvl>
+    <w:lvl w:ilvl="6" w:tentative="1">
+      <w:start w:val="1"/>
+      <w:numFmt w:val="bullet"/>
+      <w:lvlText w:val=""/>
+      <w:lvlJc w:val="left"/>
+      <w:pPr>
+        <w:tabs>
+          <w:tab w:val="num" w:pos="5040"/>
+        </w:tabs>
+        <w:ind w:left="5040" w:hanging="360"/>
+      </w:pPr>
+      <w:rPr>
+        <w:rFonts w:ascii="Wingdings" w:hAnsi="Wingdings" w:hint="default"/>
+        <w:sz w:val="20"/>
+      </w:rPr>
+    </w:lvl>
+    <w:lvl w:ilvl="7" w:tentative="1">
+      <w:start w:val="1"/>
+      <w:numFmt w:val="bullet"/>
+      <w:lvlText w:val=""/>
+      <w:lvlJc w:val="left"/>
+      <w:pPr>
+        <w:tabs>
+          <w:tab w:val="num" w:pos="5760"/>
+        </w:tabs>
+        <w:ind w:left="5760" w:hanging="360"/>
+      </w:pPr>
+      <w:rPr>
+        <w:rFonts w:ascii="Wingdings" w:hAnsi="Wingdings" w:hint="default"/>
+        <w:sz w:val="20"/>
+      </w:rPr>
+    </w:lvl>
+    <w:lvl w:ilvl="8" w:tentative="1">
+      <w:start w:val="1"/>
+      <w:numFmt w:val="bullet"/>
+      <w:lvlText w:val=""/>
+      <w:lvlJc w:val="left"/>
+      <w:pPr>
+        <w:tabs>
+          <w:tab w:val="num" w:pos="6480"/>
+        </w:tabs>
+        <w:ind w:left="6480" w:hanging="360"/>
+      </w:pPr>
+      <w:rPr>
+        <w:rFonts w:ascii="Wingdings" w:hAnsi="Wingdings" w:hint="default"/>
+        <w:sz w:val="20"/>
+      </w:rPr>
+    </w:lvl>
+  </w:abstractNum>
   <w:num w:numId="1" w16cid:durableId="1973946528">
     <w:abstractNumId w:val="0"/>
+  </w:num>
+  <w:num w:numId="2" w16cid:durableId="865677164">
+    <w:abstractNumId w:val="1"/>
   </w:num>
 </w:numbering>
 </file>
@@ -1244,6 +2279,37 @@
       <w:contextualSpacing/>
     </w:pPr>
   </w:style>
+  <w:style w:type="paragraph" w:customStyle="1" w:styleId="pdq2pgselectionanchorcontainer">
+    <w:name w:val="pdq2pg_selectionanchorcontainer"/>
+    <w:basedOn w:val="Normal"/>
+    <w:rsid w:val="00A05B9F"/>
+    <w:pPr>
+      <w:spacing w:before="100" w:beforeAutospacing="1" w:after="100" w:afterAutospacing="1" w:line="240" w:lineRule="auto"/>
+    </w:pPr>
+    <w:rPr>
+      <w:rFonts w:ascii="Times New Roman" w:eastAsia="Times New Roman" w:hAnsi="Times New Roman" w:cs="Times New Roman"/>
+      <w:sz w:val="24"/>
+      <w:szCs w:val="24"/>
+      <w:lang w:eastAsia="en-IN"/>
+    </w:rPr>
+  </w:style>
+  <w:style w:type="paragraph" w:styleId="NormalWeb">
+    <w:name w:val="Normal (Web)"/>
+    <w:basedOn w:val="Normal"/>
+    <w:uiPriority w:val="99"/>
+    <w:semiHidden/>
+    <w:unhideWhenUsed/>
+    <w:rsid w:val="00A05B9F"/>
+    <w:pPr>
+      <w:spacing w:before="100" w:beforeAutospacing="1" w:after="100" w:afterAutospacing="1" w:line="240" w:lineRule="auto"/>
+    </w:pPr>
+    <w:rPr>
+      <w:rFonts w:ascii="Times New Roman" w:eastAsia="Times New Roman" w:hAnsi="Times New Roman" w:cs="Times New Roman"/>
+      <w:sz w:val="24"/>
+      <w:szCs w:val="24"/>
+      <w:lang w:eastAsia="en-IN"/>
+    </w:rPr>
+  </w:style>
 </w:styles>
 </file>
 

</xml_diff>